<commit_message>
fix: update audience details in documentation for clarity and consistency
</commit_message>
<xml_diff>
--- a/Ansible to Orchestrator Transition/vmops/Cleanup VM Snapshots/Documentation/01_Executive_Summary.docx
+++ b/Ansible to Orchestrator Transition/vmops/Cleanup VM Snapshots/Documentation/01_Executive_Summary.docx
@@ -228,7 +228,7 @@
           <w:sz w:val="18"/>
           <w:szCs w:val="18"/>
         </w:rPr>
-        <w:t>&lt;</w:t>
+        <w:t>Department</w:t>
       </w:r>
       <w:proofErr w:type="gramEnd"/>
       <w:r>
@@ -237,7 +237,7 @@
           <w:sz w:val="18"/>
           <w:szCs w:val="18"/>
         </w:rPr>
-        <w:t>customer&gt;, &lt;groups&gt;</w:t>
+        <w:t xml:space="preserve"> of State, DT/EI/IM/CVS, IT Leadership, Infrastructure Management</w:t>
       </w:r>
     </w:p>
     <w:p>
@@ -249,7 +249,6 @@
         <w:jc w:val="center"/>
       </w:pPr>
     </w:p>
-    <w:p/>
     <w:p/>
     <w:p/>
     <w:p/>
@@ -5121,6 +5120,15 @@
 </file>
 
 <file path=customXml/item1.xml><?xml version="1.0" encoding="utf-8"?>
+<?mso-contentType ?>
+<FormTemplates xmlns="http://schemas.microsoft.com/sharepoint/v3/contenttype/forms">
+  <Display>DocumentLibraryForm</Display>
+  <Edit>DocumentLibraryForm</Edit>
+  <New>DocumentLibraryForm</New>
+</FormTemplates>
+</file>
+
+<file path=customXml/item2.xml><?xml version="1.0" encoding="utf-8"?>
 <ct:contentTypeSchema xmlns:ct="http://schemas.microsoft.com/office/2006/metadata/contentType" xmlns:ma="http://schemas.microsoft.com/office/2006/metadata/properties/metaAttributes" ct:_="" ma:_="" ma:contentTypeName="Document" ma:contentTypeID="0x010100F31F3E2BDF57D84FBD1940DB5BFE70A1" ma:contentTypeVersion="3" ma:contentTypeDescription="Create a new document." ma:contentTypeScope="" ma:versionID="39fcf3856f7d4bce19b1a7baee24e2fb">
   <xsd:schema xmlns:xsd="http://www.w3.org/2001/XMLSchema" xmlns:xs="http://www.w3.org/2001/XMLSchema" xmlns:p="http://schemas.microsoft.com/office/2006/metadata/properties" xmlns:ns2="214119f6-a8cf-4ab0-bc74-24d72ad44cda" targetNamespace="http://schemas.microsoft.com/office/2006/metadata/properties" ma:root="true" ma:fieldsID="18390e324b02758fffdb74a4b908be18" ns2:_="">
     <xsd:import namespace="214119f6-a8cf-4ab0-bc74-24d72ad44cda"/>
@@ -5258,15 +5266,6 @@
 </ct:contentTypeSchema>
 </file>
 
-<file path=customXml/item2.xml><?xml version="1.0" encoding="utf-8"?>
-<?mso-contentType ?>
-<FormTemplates xmlns="http://schemas.microsoft.com/sharepoint/v3/contenttype/forms">
-  <Display>DocumentLibraryForm</Display>
-  <Edit>DocumentLibraryForm</Edit>
-  <New>DocumentLibraryForm</New>
-</FormTemplates>
-</file>
-
 <file path=customXml/item3.xml><?xml version="1.0" encoding="utf-8"?>
 <p:properties xmlns:p="http://schemas.microsoft.com/office/2006/metadata/properties" xmlns:xsi="http://www.w3.org/2001/XMLSchema-instance" xmlns:pc="http://schemas.microsoft.com/office/infopath/2007/PartnerControls">
   <documentManagement/>
@@ -5274,6 +5273,14 @@
 </file>
 
 <file path=customXml/itemProps1.xml><?xml version="1.0" encoding="utf-8"?>
+<ds:datastoreItem xmlns:ds="http://schemas.openxmlformats.org/officeDocument/2006/customXml" ds:itemID="{FA6F2FEA-DDC7-413B-B5EB-BC685C8414B0}">
+  <ds:schemaRefs>
+    <ds:schemaRef ds:uri="http://schemas.microsoft.com/sharepoint/v3/contenttype/forms"/>
+  </ds:schemaRefs>
+</ds:datastoreItem>
+</file>
+
+<file path=customXml/itemProps2.xml><?xml version="1.0" encoding="utf-8"?>
 <ds:datastoreItem xmlns:ds="http://schemas.openxmlformats.org/officeDocument/2006/customXml" ds:itemID="{FDF9878D-B723-4284-85BE-6F755F13C5AD}">
   <ds:schemaRefs>
     <ds:schemaRef ds:uri="http://schemas.microsoft.com/office/2006/metadata/contentType"/>
@@ -5291,14 +5298,6 @@
 </ds:datastoreItem>
 </file>
 
-<file path=customXml/itemProps2.xml><?xml version="1.0" encoding="utf-8"?>
-<ds:datastoreItem xmlns:ds="http://schemas.openxmlformats.org/officeDocument/2006/customXml" ds:itemID="{FA6F2FEA-DDC7-413B-B5EB-BC685C8414B0}">
-  <ds:schemaRefs>
-    <ds:schemaRef ds:uri="http://schemas.microsoft.com/sharepoint/v3/contenttype/forms"/>
-  </ds:schemaRefs>
-</ds:datastoreItem>
-</file>
-
 <file path=customXml/itemProps3.xml><?xml version="1.0" encoding="utf-8"?>
 <ds:datastoreItem xmlns:ds="http://schemas.openxmlformats.org/officeDocument/2006/customXml" ds:itemID="{167F8C84-1551-4EBC-8E34-C5C95108CBA6}">
   <ds:schemaRefs>

</xml_diff>